<commit_message>
Document Tab 3 univariate model architectures and export Word/Markdown.
Add Holt-Winters, uni SARIMA, and claims-only DL wiring so architecture docs match the Univariate Analysis tab.

Co-authored-by: Cursor <cursoragent@cursor.com>
</commit_message>
<xml_diff>
--- a/docs/MULTIVARIATE_MODEL_ARCHITECTURE.docx
+++ b/docs/MULTIVARIATE_MODEL_ARCHITECTURE.docx
@@ -3960,6 +3960,1256 @@
           <w:p>
             <w:r>
               <w:t>MODEL_NAMES, seeds, weights</w:t>
+            </w:r>
+          </w:p>
+        </w:tc>
+      </w:tr>
+      <w:tr>
+        <w:tc>
+          <w:tcPr>
+            <w:tcW w:type="dxa" w:w="4320"/>
+          </w:tcPr>
+          <w:p>
+            <w:r>
+              <w:t>forecasting/pipeline/univariate.py</w:t>
+            </w:r>
+          </w:p>
+        </w:tc>
+        <w:tc>
+          <w:tcPr>
+            <w:tcW w:type="dxa" w:w="4320"/>
+          </w:tcPr>
+          <w:p>
+            <w:r>
+              <w:t>Tab 3 claims-only models (see univariate chapters)</w:t>
+            </w:r>
+          </w:p>
+        </w:tc>
+      </w:tr>
+    </w:tbl>
+    <w:p/>
+    <w:p>
+      <w:pPr>
+        <w:pStyle w:val="Heading1"/>
+      </w:pPr>
+      <w:r>
+        <w:t>13. Univariate Analysis tab — models and architecture</w:t>
+      </w:r>
+    </w:p>
+    <w:p>
+      <w:r>
+        <w:rPr>
+          <w:b w:val="0"/>
+          <w:sz w:val="22"/>
+        </w:rPr>
+        <w:t>Tab 3 is claims-only. It does not use production, odometer, FCO/K intensity, or other Tab 1 EXOG_COLS, and it does not train via runner.py. Source: forecasting/pipeline/univariate.py and dashboard/univariate_views.py.</w:t>
+      </w:r>
+    </w:p>
+    <w:p>
+      <w:pPr>
+        <w:jc w:val="center"/>
+      </w:pPr>
+      <w:r>
+        <w:drawing>
+          <wp:inline xmlns:a="http://schemas.openxmlformats.org/drawingml/2006/main" xmlns:pic="http://schemas.openxmlformats.org/drawingml/2006/picture">
+            <wp:extent cx="6035040" cy="3530634"/>
+            <wp:docPr id="8" name="Picture 8"/>
+            <wp:cNvGraphicFramePr>
+              <a:graphicFrameLocks noChangeAspect="1"/>
+            </wp:cNvGraphicFramePr>
+            <a:graphic>
+              <a:graphicData uri="http://schemas.openxmlformats.org/drawingml/2006/picture">
+                <pic:pic>
+                  <pic:nvPicPr>
+                    <pic:cNvPr id="0" name="pipeline_univariate.png"/>
+                    <pic:cNvPicPr/>
+                  </pic:nvPicPr>
+                  <pic:blipFill>
+                    <a:blip r:embed="rId16"/>
+                    <a:stretch>
+                      <a:fillRect/>
+                    </a:stretch>
+                  </pic:blipFill>
+                  <pic:spPr>
+                    <a:xfrm>
+                      <a:off x="0" y="0"/>
+                      <a:ext cx="6035040" cy="3530634"/>
+                    </a:xfrm>
+                    <a:prstGeom prst="rect"/>
+                  </pic:spPr>
+                </pic:pic>
+              </a:graphicData>
+            </a:graphic>
+          </wp:inline>
+        </w:drawing>
+      </w:r>
+    </w:p>
+    <w:tbl>
+      <w:tblPr>
+        <w:tblStyle w:val="TableGrid"/>
+        <w:tblW w:type="auto" w:w="0"/>
+        <w:tblLook w:firstColumn="1" w:firstRow="1" w:lastColumn="0" w:lastRow="0" w:noHBand="0" w:noVBand="1" w:val="04A0"/>
+      </w:tblPr>
+      <w:tblGrid>
+        <w:gridCol w:w="2880"/>
+        <w:gridCol w:w="2880"/>
+        <w:gridCol w:w="2880"/>
+      </w:tblGrid>
+      <w:tr>
+        <w:tc>
+          <w:tcPr>
+            <w:tcW w:type="dxa" w:w="2880"/>
+          </w:tcPr>
+          <w:p>
+            <w:r>
+              <w:rPr>
+                <w:b/>
+              </w:rPr>
+              <w:t>Model</w:t>
+            </w:r>
+          </w:p>
+        </w:tc>
+        <w:tc>
+          <w:tcPr>
+            <w:tcW w:type="dxa" w:w="2880"/>
+          </w:tcPr>
+          <w:p>
+            <w:r>
+              <w:rPr>
+                <w:b/>
+              </w:rPr>
+              <w:t>Type</w:t>
+            </w:r>
+          </w:p>
+        </w:tc>
+        <w:tc>
+          <w:tcPr>
+            <w:tcW w:type="dxa" w:w="2880"/>
+          </w:tcPr>
+          <w:p>
+            <w:r>
+              <w:rPr>
+                <w:b/>
+              </w:rPr>
+              <w:t>Tab 3 role</w:t>
+            </w:r>
+          </w:p>
+        </w:tc>
+      </w:tr>
+      <w:tr>
+        <w:tc>
+          <w:tcPr>
+            <w:tcW w:type="dxa" w:w="2880"/>
+          </w:tcPr>
+          <w:p>
+            <w:r>
+              <w:t>Holt-Winters</w:t>
+            </w:r>
+          </w:p>
+        </w:tc>
+        <w:tc>
+          <w:tcPr>
+            <w:tcW w:type="dxa" w:w="2880"/>
+          </w:tcPr>
+          <w:p>
+            <w:r>
+              <w:t>Additive exponential smoothing</w:t>
+            </w:r>
+          </w:p>
+        </w:tc>
+        <w:tc>
+          <w:tcPr>
+            <w:tcW w:type="dxa" w:w="2880"/>
+          </w:tcPr>
+          <w:p>
+            <w:r>
+              <w:t>Unique to Tab 3; level + trend + optional season</w:t>
+            </w:r>
+          </w:p>
+        </w:tc>
+      </w:tr>
+      <w:tr>
+        <w:tc>
+          <w:tcPr>
+            <w:tcW w:type="dxa" w:w="2880"/>
+          </w:tcPr>
+          <w:p>
+            <w:r>
+              <w:t>SARIMA</w:t>
+            </w:r>
+          </w:p>
+        </w:tc>
+        <w:tc>
+          <w:tcPr>
+            <w:tcW w:type="dxa" w:w="2880"/>
+          </w:tcPr>
+          <w:p>
+            <w:r>
+              <w:t>Seasonal ARIMA</w:t>
+            </w:r>
+          </w:p>
+        </w:tc>
+        <w:tc>
+          <w:tcPr>
+            <w:tcW w:type="dxa" w:w="2880"/>
+          </w:tcPr>
+          <w:p>
+            <w:r>
+              <w:t>Wider order grid than Tab 1; unscaled claims</w:t>
+            </w:r>
+          </w:p>
+        </w:tc>
+      </w:tr>
+      <w:tr>
+        <w:tc>
+          <w:tcPr>
+            <w:tcW w:type="dxa" w:w="2880"/>
+          </w:tcPr>
+          <w:p>
+            <w:r>
+              <w:t>CNN-LSTM</w:t>
+            </w:r>
+          </w:p>
+        </w:tc>
+        <w:tc>
+          <w:tcPr>
+            <w:tcW w:type="dxa" w:w="2880"/>
+          </w:tcPr>
+          <w:p>
+            <w:r>
+              <w:t>Same NumPy net as Tab 1</w:t>
+            </w:r>
+          </w:p>
+        </w:tc>
+        <w:tc>
+          <w:tcPr>
+            <w:tcW w:type="dxa" w:w="2880"/>
+          </w:tcPr>
+          <w:p>
+            <w:r>
+              <w:t>UNI features; 12 CV / 22 refit epochs</w:t>
+            </w:r>
+          </w:p>
+        </w:tc>
+      </w:tr>
+      <w:tr>
+        <w:tc>
+          <w:tcPr>
+            <w:tcW w:type="dxa" w:w="2880"/>
+          </w:tcPr>
+          <w:p>
+            <w:r>
+              <w:t>Transformer</w:t>
+            </w:r>
+          </w:p>
+        </w:tc>
+        <w:tc>
+          <w:tcPr>
+            <w:tcW w:type="dxa" w:w="2880"/>
+          </w:tcPr>
+          <w:p>
+            <w:r>
+              <w:t>Same NumPy net as Tab 1</w:t>
+            </w:r>
+          </w:p>
+        </w:tc>
+        <w:tc>
+          <w:tcPr>
+            <w:tcW w:type="dxa" w:w="2880"/>
+          </w:tcPr>
+          <w:p>
+            <w:r>
+              <w:t>Same wiring as CNN-LSTM</w:t>
+            </w:r>
+          </w:p>
+        </w:tc>
+      </w:tr>
+      <w:tr>
+        <w:tc>
+          <w:tcPr>
+            <w:tcW w:type="dxa" w:w="2880"/>
+          </w:tcPr>
+          <w:p>
+            <w:r>
+              <w:t>N-BEATS</w:t>
+            </w:r>
+          </w:p>
+        </w:tc>
+        <w:tc>
+          <w:tcPr>
+            <w:tcW w:type="dxa" w:w="2880"/>
+          </w:tcPr>
+          <w:p>
+            <w:r>
+              <w:t>Same NumPy net as Tab 1</w:t>
+            </w:r>
+          </w:p>
+        </w:tc>
+        <w:tc>
+          <w:tcPr>
+            <w:tcW w:type="dxa" w:w="2880"/>
+          </w:tcPr>
+          <w:p>
+            <w:r>
+              <w:t>Same wiring as CNN-LSTM</w:t>
+            </w:r>
+          </w:p>
+        </w:tc>
+      </w:tr>
+    </w:tbl>
+    <w:p/>
+    <w:p>
+      <w:r>
+        <w:rPr>
+          <w:b w:val="0"/>
+          <w:sz w:val="22"/>
+        </w:rPr>
+        <w:t>Selection: one checkbox → that model. Several → lowest walk-forward RMSE (not the Tab 1 composite rank). No inverse-MAE ensemble, no Keras path, no CM multipliers.</w:t>
+      </w:r>
+    </w:p>
+    <w:p>
+      <w:pPr>
+        <w:pStyle w:val="Heading2"/>
+      </w:pPr>
+      <w:r>
+        <w:t>13.1 Input, features, fusion</w:t>
+      </w:r>
+    </w:p>
+    <w:p>
+      <w:pPr>
+        <w:jc w:val="center"/>
+      </w:pPr>
+      <w:r>
+        <w:drawing>
+          <wp:inline xmlns:a="http://schemas.openxmlformats.org/drawingml/2006/main" xmlns:pic="http://schemas.openxmlformats.org/drawingml/2006/picture">
+            <wp:extent cx="5669280" cy="3928251"/>
+            <wp:docPr id="9" name="Picture 9"/>
+            <wp:cNvGraphicFramePr>
+              <a:graphicFrameLocks noChangeAspect="1"/>
+            </wp:cNvGraphicFramePr>
+            <a:graphic>
+              <a:graphicData uri="http://schemas.openxmlformats.org/drawingml/2006/picture">
+                <pic:pic>
+                  <pic:nvPicPr>
+                    <pic:cNvPr id="0" name="uni_features.png"/>
+                    <pic:cNvPicPr/>
+                  </pic:nvPicPr>
+                  <pic:blipFill>
+                    <a:blip r:embed="rId17"/>
+                    <a:stretch>
+                      <a:fillRect/>
+                    </a:stretch>
+                  </pic:blipFill>
+                  <pic:spPr>
+                    <a:xfrm>
+                      <a:off x="0" y="0"/>
+                      <a:ext cx="5669280" cy="3928251"/>
+                    </a:xfrm>
+                    <a:prstGeom prst="rect"/>
+                  </pic:spPr>
+                </pic:pic>
+              </a:graphicData>
+            </a:graphic>
+          </wp:inline>
+        </w:drawing>
+      </w:r>
+    </w:p>
+    <w:p>
+      <w:r>
+        <w:rPr>
+          <w:b w:val="0"/>
+          <w:sz w:val="22"/>
+        </w:rPr>
+        <w:t>Inputs: Tab 1 claims (production not required) or a monthly CSV (Part Name, Month, Claims). Need at least 10 months and positive total claims. UNI_FEATURE_COLS: Lag 1/2/3/12, rolling mean 3/6/12, rolling std 3/6, Month/Quarter/Year, Trend_Index, Seasonality_Index (month-mean / global-mean). DL windows concatenate scaled claims with these 14 columns (F about 15). Lookback W = min(12, max(4, T//3)). Holt-Winters and SARIMA ignore UNI features.</w:t>
+      </w:r>
+    </w:p>
+    <w:p>
+      <w:pPr>
+        <w:pStyle w:val="Heading2"/>
+      </w:pPr>
+      <w:r>
+        <w:t>13.2 Holt-Winters — layer breakdown</w:t>
+      </w:r>
+    </w:p>
+    <w:p>
+      <w:pPr>
+        <w:jc w:val="center"/>
+      </w:pPr>
+      <w:r>
+        <w:drawing>
+          <wp:inline xmlns:a="http://schemas.openxmlformats.org/drawingml/2006/main" xmlns:pic="http://schemas.openxmlformats.org/drawingml/2006/picture">
+            <wp:extent cx="5669280" cy="3928251"/>
+            <wp:docPr id="10" name="Picture 10"/>
+            <wp:cNvGraphicFramePr>
+              <a:graphicFrameLocks noChangeAspect="1"/>
+            </wp:cNvGraphicFramePr>
+            <a:graphic>
+              <a:graphicData uri="http://schemas.openxmlformats.org/drawingml/2006/picture">
+                <pic:pic>
+                  <pic:nvPicPr>
+                    <pic:cNvPr id="0" name="holt_winters.png"/>
+                    <pic:cNvPicPr/>
+                  </pic:nvPicPr>
+                  <pic:blipFill>
+                    <a:blip r:embed="rId18"/>
+                    <a:stretch>
+                      <a:fillRect/>
+                    </a:stretch>
+                  </pic:blipFill>
+                  <pic:spPr>
+                    <a:xfrm>
+                      <a:off x="0" y="0"/>
+                      <a:ext cx="5669280" cy="3928251"/>
+                    </a:xfrm>
+                    <a:prstGeom prst="rect"/>
+                  </pic:spPr>
+                </pic:pic>
+              </a:graphicData>
+            </a:graphic>
+          </wp:inline>
+        </w:drawing>
+      </w:r>
+    </w:p>
+    <w:tbl>
+      <w:tblPr>
+        <w:tblStyle w:val="TableGrid"/>
+        <w:tblW w:type="auto" w:w="0"/>
+        <w:tblLook w:firstColumn="1" w:firstRow="1" w:lastColumn="0" w:lastRow="0" w:noHBand="0" w:noVBand="1" w:val="04A0"/>
+      </w:tblPr>
+      <w:tblGrid>
+        <w:gridCol w:w="2880"/>
+        <w:gridCol w:w="2880"/>
+        <w:gridCol w:w="2880"/>
+      </w:tblGrid>
+      <w:tr>
+        <w:tc>
+          <w:tcPr>
+            <w:tcW w:type="dxa" w:w="2880"/>
+          </w:tcPr>
+          <w:p>
+            <w:r>
+              <w:rPr>
+                <w:b/>
+              </w:rPr>
+              <w:t>Stage</w:t>
+            </w:r>
+          </w:p>
+        </w:tc>
+        <w:tc>
+          <w:tcPr>
+            <w:tcW w:type="dxa" w:w="2880"/>
+          </w:tcPr>
+          <w:p>
+            <w:r>
+              <w:rPr>
+                <w:b/>
+              </w:rPr>
+              <w:t>What happens</w:t>
+            </w:r>
+          </w:p>
+        </w:tc>
+        <w:tc>
+          <w:tcPr>
+            <w:tcW w:type="dxa" w:w="2880"/>
+          </w:tcPr>
+          <w:p>
+            <w:r>
+              <w:rPr>
+                <w:b/>
+              </w:rPr>
+              <w:t>Params</w:t>
+            </w:r>
+          </w:p>
+        </w:tc>
+      </w:tr>
+      <w:tr>
+        <w:tc>
+          <w:tcPr>
+            <w:tcW w:type="dxa" w:w="2880"/>
+          </w:tcPr>
+          <w:p>
+            <w:r>
+              <w:t>Input</w:t>
+            </w:r>
+          </w:p>
+        </w:tc>
+        <w:tc>
+          <w:tcPr>
+            <w:tcW w:type="dxa" w:w="2880"/>
+          </w:tcPr>
+          <w:p>
+            <w:r>
+              <w:t>1-D claim_count</w:t>
+            </w:r>
+          </w:p>
+        </w:tc>
+        <w:tc>
+          <w:tcPr>
+            <w:tcW w:type="dxa" w:w="2880"/>
+          </w:tcPr>
+          <w:p>
+            <w:r>
+              <w:t>No MinMax</w:t>
+            </w:r>
+          </w:p>
+        </w:tc>
+      </w:tr>
+      <w:tr>
+        <w:tc>
+          <w:tcPr>
+            <w:tcW w:type="dxa" w:w="2880"/>
+          </w:tcPr>
+          <w:p>
+            <w:r>
+              <w:t>Preprocess</w:t>
+            </w:r>
+          </w:p>
+        </w:tc>
+        <w:tc>
+          <w:tcPr>
+            <w:tcW w:type="dxa" w:w="2880"/>
+          </w:tcPr>
+          <w:p>
+            <w:r>
+              <w:t>sp = min(12, n//2); seasonal only if n &gt;= 2*sp</w:t>
+            </w:r>
+          </w:p>
+        </w:tc>
+        <w:tc>
+          <w:tcPr>
+            <w:tcW w:type="dxa" w:w="2880"/>
+          </w:tcPr>
+          <w:p>
+            <w:r>
+              <w:t>holdout 3-6 months</w:t>
+            </w:r>
+          </w:p>
+        </w:tc>
+      </w:tr>
+      <w:tr>
+        <w:tc>
+          <w:tcPr>
+            <w:tcW w:type="dxa" w:w="2880"/>
+          </w:tcPr>
+          <w:p>
+            <w:r>
+              <w:t>Level</w:t>
+            </w:r>
+          </w:p>
+        </w:tc>
+        <w:tc>
+          <w:tcPr>
+            <w:tcW w:type="dxa" w:w="2880"/>
+          </w:tcPr>
+          <w:p>
+            <w:r>
+              <w:t>Additive TES level</w:t>
+            </w:r>
+          </w:p>
+        </w:tc>
+        <w:tc>
+          <w:tcPr>
+            <w:tcW w:type="dxa" w:w="2880"/>
+          </w:tcPr>
+          <w:p>
+            <w:r>
+              <w:t>alpha in {0.1, 0.3, 0.5, 0.8}</w:t>
+            </w:r>
+          </w:p>
+        </w:tc>
+      </w:tr>
+      <w:tr>
+        <w:tc>
+          <w:tcPr>
+            <w:tcW w:type="dxa" w:w="2880"/>
+          </w:tcPr>
+          <w:p>
+            <w:r>
+              <w:t>Trend</w:t>
+            </w:r>
+          </w:p>
+        </w:tc>
+        <w:tc>
+          <w:tcPr>
+            <w:tcW w:type="dxa" w:w="2880"/>
+          </w:tcPr>
+          <w:p>
+            <w:r>
+              <w:t>Additive slope</w:t>
+            </w:r>
+          </w:p>
+        </w:tc>
+        <w:tc>
+          <w:tcPr>
+            <w:tcW w:type="dxa" w:w="2880"/>
+          </w:tcPr>
+          <w:p>
+            <w:r>
+              <w:t>beta in {0.05, 0.2, 0.4}</w:t>
+            </w:r>
+          </w:p>
+        </w:tc>
+      </w:tr>
+      <w:tr>
+        <w:tc>
+          <w:tcPr>
+            <w:tcW w:type="dxa" w:w="2880"/>
+          </w:tcPr>
+          <w:p>
+            <w:r>
+              <w:t>Season</w:t>
+            </w:r>
+          </w:p>
+        </w:tc>
+        <w:tc>
+          <w:tcPr>
+            <w:tcW w:type="dxa" w:w="2880"/>
+          </w:tcPr>
+          <w:p>
+            <w:r>
+              <w:t>Additive yearly or omitted</w:t>
+            </w:r>
+          </w:p>
+        </w:tc>
+        <w:tc>
+          <w:tcPr>
+            <w:tcW w:type="dxa" w:w="2880"/>
+          </w:tcPr>
+          <w:p>
+            <w:r>
+              <w:t>gamma in {0.1, 0.3, 0.5}</w:t>
+            </w:r>
+          </w:p>
+        </w:tc>
+      </w:tr>
+      <w:tr>
+        <w:tc>
+          <w:tcPr>
+            <w:tcW w:type="dxa" w:w="2880"/>
+          </w:tcPr>
+          <w:p>
+            <w:r>
+              <w:t>Fit</w:t>
+            </w:r>
+          </w:p>
+        </w:tc>
+        <w:tc>
+          <w:tcPr>
+            <w:tcW w:type="dxa" w:w="2880"/>
+          </w:tcPr>
+          <w:p>
+            <w:r>
+              <w:t>ExponentialSmoothing estimated init, optimized=False</w:t>
+            </w:r>
+          </w:p>
+        </w:tc>
+        <w:tc>
+          <w:tcPr>
+            <w:tcW w:type="dxa" w:w="2880"/>
+          </w:tcPr>
+          <w:p>
+            <w:r>
+              <w:t>statsmodels</w:t>
+            </w:r>
+          </w:p>
+        </w:tc>
+      </w:tr>
+      <w:tr>
+        <w:tc>
+          <w:tcPr>
+            <w:tcW w:type="dxa" w:w="2880"/>
+          </w:tcPr>
+          <w:p>
+            <w:r>
+              <w:t>Output</w:t>
+            </w:r>
+          </w:p>
+        </w:tc>
+        <w:tc>
+          <w:tcPr>
+            <w:tcW w:type="dxa" w:w="2880"/>
+          </w:tcPr>
+          <w:p>
+            <w:r>
+              <w:t>forecast(H) clip &gt;= 0; residual sigma for CI</w:t>
+            </w:r>
+          </w:p>
+        </w:tc>
+        <w:tc>
+          <w:tcPr>
+            <w:tcW w:type="dxa" w:w="2880"/>
+          </w:tcPr>
+          <w:p>
+            <w:r>
+              <w:t>Fail -&gt; last value</w:t>
+            </w:r>
+          </w:p>
+        </w:tc>
+      </w:tr>
+    </w:tbl>
+    <w:p/>
+    <w:p>
+      <w:pPr>
+        <w:spacing w:after="160"/>
+      </w:pPr>
+      <w:r>
+        <w:rPr>
+          <w:rFonts w:ascii="Consolas" w:hAnsi="Consolas"/>
+          <w:sz w:val="17"/>
+        </w:rPr>
+        <w:t>l_t = a (y_t - s_{t-m}) + (1-a)(l_{t-1} + b_{t-1})</w:t>
+        <w:br/>
+        <w:t>b_t = b (l_t - l_{t-1}) + (1-b) b_{t-1}</w:t>
+        <w:br/>
+        <w:t>s_t = g (y_t - l_{t-1} - b_{t-1}) + (1-g) s_{t-m}</w:t>
+        <w:br/>
+        <w:t>yhat_{t+h} = l_t + h b_t + seasonal_lag</w:t>
+        <w:br/>
+        <w:t>Grid a x b x g on holdout RMSE, then refit on full y.</w:t>
+      </w:r>
+    </w:p>
+    <w:p>
+      <w:r>
+        <w:rPr>
+          <w:b w:val="0"/>
+          <w:sz w:val="22"/>
+        </w:rPr>
+        <w:t>Unique extras: holdout RMSE grid; sigma feeds 95% CI; alpha/beta/gamma shown in accordion 3; no dropout/attention.</w:t>
+      </w:r>
+    </w:p>
+    <w:p>
+      <w:pPr>
+        <w:pStyle w:val="Heading2"/>
+      </w:pPr>
+      <w:r>
+        <w:t>13.3 Univariate SARIMA</w:t>
+      </w:r>
+    </w:p>
+    <w:p>
+      <w:r>
+        <w:rPr>
+          <w:b w:val="0"/>
+          <w:sz w:val="22"/>
+        </w:rPr>
+        <w:t>Same SARIMAX engine as Tab 1 (fit_sarima) on unscaled claims. Orders: (1,1,1), (1,1,0), (0,1,1), (2,1,1). Seasonal: (1,1,0,12), (0,1,1,12), (1,0,1,12). Pick lowest RMSE on a tail split; fallback seasonal-naive/mean. Orders printed beside Holt-Winters on Tab 3.</w:t>
+      </w:r>
+    </w:p>
+    <w:p>
+      <w:pPr>
+        <w:pStyle w:val="Heading2"/>
+      </w:pPr>
+      <w:r>
+        <w:t>13.4 CNN-LSTM, Transformer, N-BEATS on Tab 3</w:t>
+      </w:r>
+    </w:p>
+    <w:p>
+      <w:pPr>
+        <w:jc w:val="center"/>
+      </w:pPr>
+      <w:r>
+        <w:drawing>
+          <wp:inline xmlns:a="http://schemas.openxmlformats.org/drawingml/2006/main" xmlns:pic="http://schemas.openxmlformats.org/drawingml/2006/picture">
+            <wp:extent cx="5669280" cy="3928251"/>
+            <wp:docPr id="11" name="Picture 11"/>
+            <wp:cNvGraphicFramePr>
+              <a:graphicFrameLocks noChangeAspect="1"/>
+            </wp:cNvGraphicFramePr>
+            <a:graphic>
+              <a:graphicData uri="http://schemas.openxmlformats.org/drawingml/2006/picture">
+                <pic:pic>
+                  <pic:nvPicPr>
+                    <pic:cNvPr id="0" name="uni_dl_runtime.png"/>
+                    <pic:cNvPicPr/>
+                  </pic:nvPicPr>
+                  <pic:blipFill>
+                    <a:blip r:embed="rId19"/>
+                    <a:stretch>
+                      <a:fillRect/>
+                    </a:stretch>
+                  </pic:blipFill>
+                  <pic:spPr>
+                    <a:xfrm>
+                      <a:off x="0" y="0"/>
+                      <a:ext cx="5669280" cy="3928251"/>
+                    </a:xfrm>
+                    <a:prstGeom prst="rect"/>
+                  </pic:spPr>
+                </pic:pic>
+              </a:graphicData>
+            </a:graphic>
+          </wp:inline>
+        </w:drawing>
+      </w:r>
+    </w:p>
+    <w:p>
+      <w:r>
+        <w:rPr>
+          <w:b w:val="0"/>
+          <w:sz w:val="22"/>
+        </w:rPr>
+        <w:t>Layer stacks are identical to Tab 1 (CNN 16-&gt;8 + LSTM-32; Transformer MHA+FFN; N-BEATS 6 polynomial blocks). Differences are wiring: UNI features, epochs 12 (CV) and 22 (refit), no HP grid, fail -&gt; last claim, short H padded with last step, rank by RMSE only. See multivariate sections 3-5 for gate/attention/basis detail.</w:t>
+      </w:r>
+    </w:p>
+    <w:p>
+      <w:pPr>
+        <w:spacing w:after="160"/>
+      </w:pPr>
+      <w:r>
+        <w:rPr>
+          <w:rFonts w:ascii="Consolas" w:hAnsi="Consolas"/>
+          <w:sz w:val="17"/>
+        </w:rPr>
+        <w:t>CV:  ctor(..., horizon=1, epochs=12)</w:t>
+        <w:br/>
+        <w:t>Refit: ctor(..., horizon=H, epochs=22)</w:t>
+        <w:br/>
+        <w:t>W = min(12, max(4, T//3))</w:t>
+        <w:br/>
+        <w:t>CI: best +/- 1.96 * max(0.35*std(last12), 0.5*HW_sigma, 1)</w:t>
+      </w:r>
+    </w:p>
+    <w:p>
+      <w:pPr>
+        <w:pStyle w:val="Heading2"/>
+      </w:pPr>
+      <w:r>
+        <w:t>13.5 Tab 3 UI outputs</w:t>
+      </w:r>
+    </w:p>
+    <w:tbl>
+      <w:tblPr>
+        <w:tblStyle w:val="TableGrid"/>
+        <w:tblW w:type="auto" w:w="0"/>
+        <w:tblLook w:firstColumn="1" w:firstRow="1" w:lastColumn="0" w:lastRow="0" w:noHBand="0" w:noVBand="1" w:val="04A0"/>
+      </w:tblPr>
+      <w:tblGrid>
+        <w:gridCol w:w="4320"/>
+        <w:gridCol w:w="4320"/>
+      </w:tblGrid>
+      <w:tr>
+        <w:tc>
+          <w:tcPr>
+            <w:tcW w:type="dxa" w:w="4320"/>
+          </w:tcPr>
+          <w:p>
+            <w:r>
+              <w:rPr>
+                <w:b/>
+              </w:rPr>
+              <w:t>Control</w:t>
+            </w:r>
+          </w:p>
+        </w:tc>
+        <w:tc>
+          <w:tcPr>
+            <w:tcW w:type="dxa" w:w="4320"/>
+          </w:tcPr>
+          <w:p>
+            <w:r>
+              <w:rPr>
+                <w:b/>
+              </w:rPr>
+              <w:t>Meaning</w:t>
+            </w:r>
+          </w:p>
+        </w:tc>
+      </w:tr>
+      <w:tr>
+        <w:tc>
+          <w:tcPr>
+            <w:tcW w:type="dxa" w:w="4320"/>
+          </w:tcPr>
+          <w:p>
+            <w:r>
+              <w:t>Monthly CSV</w:t>
+            </w:r>
+          </w:p>
+        </w:tc>
+        <w:tc>
+          <w:tcPr>
+            <w:tcW w:type="dxa" w:w="4320"/>
+          </w:tcPr>
+          <w:p>
+            <w:r>
+              <w:t>Does not change Tab 1; Part Name / Month / Claims</w:t>
+            </w:r>
+          </w:p>
+        </w:tc>
+      </w:tr>
+      <w:tr>
+        <w:tc>
+          <w:tcPr>
+            <w:tcW w:type="dxa" w:w="4320"/>
+          </w:tcPr>
+          <w:p>
+            <w:r>
+              <w:t>Model checkboxes</w:t>
+            </w:r>
+          </w:p>
+        </w:tc>
+        <w:tc>
+          <w:tcPr>
+            <w:tcW w:type="dxa" w:w="4320"/>
+          </w:tcPr>
+          <w:p>
+            <w:r>
+              <w:t>Empty -&gt; all five UNI_MODELS</w:t>
+            </w:r>
+          </w:p>
+        </w:tc>
+      </w:tr>
+      <w:tr>
+        <w:tc>
+          <w:tcPr>
+            <w:tcW w:type="dxa" w:w="4320"/>
+          </w:tcPr>
+          <w:p>
+            <w:r>
+              <w:t>1. Overview</w:t>
+            </w:r>
+          </w:p>
+        </w:tc>
+        <w:tc>
+          <w:tcPr>
+            <w:tcW w:type="dxa" w:w="4320"/>
+          </w:tcPr>
+          <w:p>
+            <w:r>
+              <w:t>Records, date span, missing months, quality status</w:t>
+            </w:r>
+          </w:p>
+        </w:tc>
+      </w:tr>
+      <w:tr>
+        <w:tc>
+          <w:tcPr>
+            <w:tcW w:type="dxa" w:w="4320"/>
+          </w:tcPr>
+          <w:p>
+            <w:r>
+              <w:t>2. Trend</w:t>
+            </w:r>
+          </w:p>
+        </w:tc>
+        <w:tc>
+          <w:tcPr>
+            <w:tcW w:type="dxa" w:w="4320"/>
+          </w:tcPr>
+          <w:p>
+            <w:r>
+              <w:t>Claims + rolling 3/12; seasonality bars; growth/6-mo %</w:t>
+            </w:r>
+          </w:p>
+        </w:tc>
+      </w:tr>
+      <w:tr>
+        <w:tc>
+          <w:tcPr>
+            <w:tcW w:type="dxa" w:w="4320"/>
+          </w:tcPr>
+          <w:p>
+            <w:r>
+              <w:t>3. Results</w:t>
+            </w:r>
+          </w:p>
+        </w:tc>
+        <w:tc>
+          <w:tcPr>
+            <w:tcW w:type="dxa" w:w="4320"/>
+          </w:tcPr>
+          <w:p>
+            <w:r>
+              <w:t>RMSE/MAE/MAPE rank + star; HW params; SARIMA orders</w:t>
+            </w:r>
+          </w:p>
+        </w:tc>
+      </w:tr>
+      <w:tr>
+        <w:tc>
+          <w:tcPr>
+            <w:tcW w:type="dxa" w:w="4320"/>
+          </w:tcPr>
+          <w:p>
+            <w:r>
+              <w:t>4. Forecast</w:t>
+            </w:r>
+          </w:p>
+        </w:tc>
+        <w:tc>
+          <w:tcPr>
+            <w:tcW w:type="dxa" w:w="4320"/>
+          </w:tcPr>
+          <w:p>
+            <w:r>
+              <w:t>Best solid line, others dotted, 95% CI, 12-row table</w:t>
+            </w:r>
+          </w:p>
+        </w:tc>
+      </w:tr>
+      <w:tr>
+        <w:tc>
+          <w:tcPr>
+            <w:tcW w:type="dxa" w:w="4320"/>
+          </w:tcPr>
+          <w:p>
+            <w:r>
+              <w:t>5. Insights</w:t>
+            </w:r>
+          </w:p>
+        </w:tc>
+        <w:tc>
+          <w:tcPr>
+            <w:tcW w:type="dxa" w:w="4320"/>
+          </w:tcPr>
+          <w:p>
+            <w:r>
+              <w:t>Trend/season/volatility/best RMSE/quality notes</w:t>
+            </w:r>
+          </w:p>
+        </w:tc>
+      </w:tr>
+      <w:tr>
+        <w:tc>
+          <w:tcPr>
+            <w:tcW w:type="dxa" w:w="4320"/>
+          </w:tcPr>
+          <w:p>
+            <w:r>
+              <w:t>Tab 6 PPT</w:t>
+            </w:r>
+          </w:p>
+        </w:tc>
+        <w:tc>
+          <w:tcPr>
+            <w:tcW w:type="dxa" w:w="4320"/>
+          </w:tcPr>
+          <w:p>
+            <w:r>
+              <w:t>Univariate slides only if Tab 3 has been run</w:t>
+            </w:r>
+          </w:p>
+        </w:tc>
+      </w:tr>
+    </w:tbl>
+    <w:p/>
+    <w:p>
+      <w:pPr>
+        <w:pStyle w:val="Heading2"/>
+      </w:pPr>
+      <w:r>
+        <w:t>13.6 Univariate edge cases</w:t>
+      </w:r>
+    </w:p>
+    <w:tbl>
+      <w:tblPr>
+        <w:tblStyle w:val="TableGrid"/>
+        <w:tblW w:type="auto" w:w="0"/>
+        <w:tblLook w:firstColumn="1" w:firstRow="1" w:lastColumn="0" w:lastRow="0" w:noHBand="0" w:noVBand="1" w:val="04A0"/>
+      </w:tblPr>
+      <w:tblGrid>
+        <w:gridCol w:w="4320"/>
+        <w:gridCol w:w="4320"/>
+      </w:tblGrid>
+      <w:tr>
+        <w:tc>
+          <w:tcPr>
+            <w:tcW w:type="dxa" w:w="4320"/>
+          </w:tcPr>
+          <w:p>
+            <w:r>
+              <w:rPr>
+                <w:b/>
+              </w:rPr>
+              <w:t>Case</w:t>
+            </w:r>
+          </w:p>
+        </w:tc>
+        <w:tc>
+          <w:tcPr>
+            <w:tcW w:type="dxa" w:w="4320"/>
+          </w:tcPr>
+          <w:p>
+            <w:r>
+              <w:rPr>
+                <w:b/>
+              </w:rPr>
+              <w:t>Expected</w:t>
+            </w:r>
+          </w:p>
+        </w:tc>
+      </w:tr>
+      <w:tr>
+        <w:tc>
+          <w:tcPr>
+            <w:tcW w:type="dxa" w:w="4320"/>
+          </w:tcPr>
+          <w:p>
+            <w:r>
+              <w:t>No data</w:t>
+            </w:r>
+          </w:p>
+        </w:tc>
+        <w:tc>
+          <w:tcPr>
+            <w:tcW w:type="dxa" w:w="4320"/>
+          </w:tcPr>
+          <w:p>
+            <w:r>
+              <w:t>Prompt to load Tab 1 or CSV</w:t>
+            </w:r>
+          </w:p>
+        </w:tc>
+      </w:tr>
+      <w:tr>
+        <w:tc>
+          <w:tcPr>
+            <w:tcW w:type="dxa" w:w="4320"/>
+          </w:tcPr>
+          <w:p>
+            <w:r>
+              <w:t>&lt; 10 months or zero claims</w:t>
+            </w:r>
+          </w:p>
+        </w:tc>
+        <w:tc>
+          <w:tcPr>
+            <w:tcW w:type="dxa" w:w="4320"/>
+          </w:tcPr>
+          <w:p>
+            <w:r>
+              <w:t>Run returns None</w:t>
+            </w:r>
+          </w:p>
+        </w:tc>
+      </w:tr>
+      <w:tr>
+        <w:tc>
+          <w:tcPr>
+            <w:tcW w:type="dxa" w:w="4320"/>
+          </w:tcPr>
+          <w:p>
+            <w:r>
+              <w:t>Gaps in months</w:t>
+            </w:r>
+          </w:p>
+        </w:tc>
+        <w:tc>
+          <w:tcPr>
+            <w:tcW w:type="dxa" w:w="4320"/>
+          </w:tcPr>
+          <w:p>
+            <w:r>
+              <w:t>Filled with 0; status Gaps filled</w:t>
+            </w:r>
+          </w:p>
+        </w:tc>
+      </w:tr>
+      <w:tr>
+        <w:tc>
+          <w:tcPr>
+            <w:tcW w:type="dxa" w:w="4320"/>
+          </w:tcPr>
+          <w:p>
+            <w:r>
+              <w:t>Short series for HW season</w:t>
+            </w:r>
+          </w:p>
+        </w:tc>
+        <w:tc>
+          <w:tcPr>
+            <w:tcW w:type="dxa" w:w="4320"/>
+          </w:tcPr>
+          <w:p>
+            <w:r>
+              <w:t>seasonal=None; gamma unused</w:t>
+            </w:r>
+          </w:p>
+        </w:tc>
+      </w:tr>
+      <w:tr>
+        <w:tc>
+          <w:tcPr>
+            <w:tcW w:type="dxa" w:w="4320"/>
+          </w:tcPr>
+          <w:p>
+            <w:r>
+              <w:t>DL too few windows</w:t>
+            </w:r>
+          </w:p>
+        </w:tc>
+        <w:tc>
+          <w:tcPr>
+            <w:tcW w:type="dxa" w:w="4320"/>
+          </w:tcPr>
+          <w:p>
+            <w:r>
+              <w:t>Naive last claim</w:t>
+            </w:r>
+          </w:p>
+        </w:tc>
+      </w:tr>
+      <w:tr>
+        <w:tc>
+          <w:tcPr>
+            <w:tcW w:type="dxa" w:w="4320"/>
+          </w:tcPr>
+          <w:p>
+            <w:r>
+              <w:t>One model checked</w:t>
+            </w:r>
+          </w:p>
+        </w:tc>
+        <w:tc>
+          <w:tcPr>
+            <w:tcW w:type="dxa" w:w="4320"/>
+          </w:tcPr>
+          <w:p>
+            <w:r>
+              <w:t>That model is best</w:t>
+            </w:r>
+          </w:p>
+        </w:tc>
+      </w:tr>
+      <w:tr>
+        <w:tc>
+          <w:tcPr>
+            <w:tcW w:type="dxa" w:w="4320"/>
+          </w:tcPr>
+          <w:p>
+            <w:r>
+              <w:t>Empty checkboxes</w:t>
+            </w:r>
+          </w:p>
+        </w:tc>
+        <w:tc>
+          <w:tcPr>
+            <w:tcW w:type="dxa" w:w="4320"/>
+          </w:tcPr>
+          <w:p>
+            <w:r>
+              <w:t>All five models</w:t>
+            </w:r>
+          </w:p>
+        </w:tc>
+      </w:tr>
+      <w:tr>
+        <w:tc>
+          <w:tcPr>
+            <w:tcW w:type="dxa" w:w="4320"/>
+          </w:tcPr>
+          <w:p>
+            <w:r>
+              <w:t>Winner vs Tab 1</w:t>
+            </w:r>
+          </w:p>
+        </w:tc>
+        <w:tc>
+          <w:tcPr>
+            <w:tcW w:type="dxa" w:w="4320"/>
+          </w:tcPr>
+          <w:p>
+            <w:r>
+              <w:t>Often different — do not mix rankings</w:t>
             </w:r>
           </w:p>
         </w:tc>

</xml_diff>